<commit_message>
Audit working and dashboard date filter
</commit_message>
<xml_diff>
--- a/Feature_Suggestions.docx
+++ b/Feature_Suggestions.docx
@@ -138,6 +138,7 @@
         <w:pStyle w:val="ListBullet"/>
       </w:pPr>
       <w:r>
+        <w:lastRenderedPageBreak/>
         <w:t>Session Expiry &amp; Activity Log - Track when users login and logout.</w:t>
       </w:r>
     </w:p>
@@ -287,7 +288,1896 @@
         <w:t>Each feature should be scoped with effort estimation before sprint planning.</w:t>
       </w:r>
     </w:p>
-    <w:p/>
+    <w:p>
+      <w:r>
+        <w:br w:type="page"/>
+      </w:r>
+    </w:p>
+    <w:p>
+      <w:r>
+        <w:lastRenderedPageBreak/>
+        <w:t xml:space="preserve">Project ka structure </w:t>
+      </w:r>
+      <w:proofErr w:type="spellStart"/>
+      <w:r>
+        <w:t>dekh</w:t>
+      </w:r>
+      <w:proofErr w:type="spellEnd"/>
+      <w:r>
+        <w:t xml:space="preserve"> </w:t>
+      </w:r>
+      <w:proofErr w:type="spellStart"/>
+      <w:r>
+        <w:t>kar</w:t>
+      </w:r>
+      <w:proofErr w:type="spellEnd"/>
+      <w:r>
+        <w:t xml:space="preserve"> yeh enhancements suggest </w:t>
+      </w:r>
+      <w:proofErr w:type="spellStart"/>
+      <w:r>
+        <w:t>kar</w:t>
+      </w:r>
+      <w:proofErr w:type="spellEnd"/>
+      <w:r>
+        <w:t xml:space="preserve"> </w:t>
+      </w:r>
+      <w:proofErr w:type="spellStart"/>
+      <w:r>
+        <w:t>raha</w:t>
+      </w:r>
+      <w:proofErr w:type="spellEnd"/>
+      <w:r>
+        <w:t xml:space="preserve"> </w:t>
+      </w:r>
+      <w:proofErr w:type="spellStart"/>
+      <w:r>
+        <w:t>hoon</w:t>
+      </w:r>
+      <w:proofErr w:type="spellEnd"/>
+      <w:r>
+        <w:t xml:space="preserve"> — point wise, priority </w:t>
+      </w:r>
+      <w:proofErr w:type="spellStart"/>
+      <w:r>
+        <w:t>ke</w:t>
+      </w:r>
+      <w:proofErr w:type="spellEnd"/>
+      <w:r>
+        <w:t xml:space="preserve"> </w:t>
+      </w:r>
+      <w:proofErr w:type="spellStart"/>
+      <w:r>
+        <w:t>sath</w:t>
+      </w:r>
+      <w:proofErr w:type="spellEnd"/>
+      <w:r>
+        <w:t>:</w:t>
+      </w:r>
+    </w:p>
+    <w:p>
+      <w:r>
+        <w:t xml:space="preserve">A. Security &amp; Access (sab se </w:t>
+      </w:r>
+      <w:proofErr w:type="spellStart"/>
+      <w:r>
+        <w:t>zaroori</w:t>
+      </w:r>
+      <w:proofErr w:type="spellEnd"/>
+      <w:r>
+        <w:t>)</w:t>
+      </w:r>
+    </w:p>
+    <w:p>
+      <w:r>
+        <w:t xml:space="preserve">1. Role-based permission system — </w:t>
+      </w:r>
+      <w:proofErr w:type="spellStart"/>
+      <w:r>
+        <w:t>abhi</w:t>
+      </w:r>
+      <w:proofErr w:type="spellEnd"/>
+      <w:r>
+        <w:t xml:space="preserve"> </w:t>
+      </w:r>
+      <w:proofErr w:type="spellStart"/>
+      <w:r>
+        <w:t>sirf</w:t>
+      </w:r>
+      <w:proofErr w:type="spellEnd"/>
+      <w:r>
+        <w:t xml:space="preserve"> </w:t>
+      </w:r>
+      <w:proofErr w:type="spellStart"/>
+      <w:r>
+        <w:t>UserType</w:t>
+      </w:r>
+      <w:proofErr w:type="spellEnd"/>
+      <w:r>
+        <w:t xml:space="preserve"> == 1 magic numbers </w:t>
+      </w:r>
+      <w:proofErr w:type="spellStart"/>
+      <w:r>
+        <w:t>hain</w:t>
+      </w:r>
+      <w:proofErr w:type="spellEnd"/>
+      <w:r>
+        <w:t xml:space="preserve">. SessionHelper.cs:36-37 </w:t>
+      </w:r>
+      <w:proofErr w:type="spellStart"/>
+      <w:r>
+        <w:t>mein</w:t>
+      </w:r>
+      <w:proofErr w:type="spellEnd"/>
+      <w:r>
+        <w:t xml:space="preserve"> RIGHTSLIST/MENULIST constants define </w:t>
+      </w:r>
+      <w:proofErr w:type="spellStart"/>
+      <w:r>
+        <w:t>hain</w:t>
+      </w:r>
+      <w:proofErr w:type="spellEnd"/>
+      <w:r>
+        <w:t xml:space="preserve"> par </w:t>
+      </w:r>
+      <w:proofErr w:type="spellStart"/>
+      <w:r>
+        <w:t>kabhi</w:t>
+      </w:r>
+      <w:proofErr w:type="spellEnd"/>
+      <w:r>
+        <w:t xml:space="preserve"> use </w:t>
+      </w:r>
+      <w:proofErr w:type="spellStart"/>
+      <w:r>
+        <w:t>nahi</w:t>
+      </w:r>
+      <w:proofErr w:type="spellEnd"/>
+      <w:r>
+        <w:t xml:space="preserve"> </w:t>
+      </w:r>
+      <w:proofErr w:type="spellStart"/>
+      <w:r>
+        <w:t>hote</w:t>
+      </w:r>
+      <w:proofErr w:type="spellEnd"/>
+      <w:r>
+        <w:t xml:space="preserve">. Har user type ko per-menu/per-action rights </w:t>
+      </w:r>
+      <w:proofErr w:type="spellStart"/>
+      <w:r>
+        <w:t>milne</w:t>
+      </w:r>
+      <w:proofErr w:type="spellEnd"/>
+      <w:r>
+        <w:t xml:space="preserve"> </w:t>
+      </w:r>
+      <w:proofErr w:type="spellStart"/>
+      <w:r>
+        <w:t>chahiye</w:t>
+      </w:r>
+      <w:proofErr w:type="spellEnd"/>
+      <w:r>
+        <w:t xml:space="preserve"> (e.g. Authorize user invoice delete </w:t>
+      </w:r>
+      <w:proofErr w:type="spellStart"/>
+      <w:r>
+        <w:t>na</w:t>
+      </w:r>
+      <w:proofErr w:type="spellEnd"/>
+      <w:r>
+        <w:t xml:space="preserve"> </w:t>
+      </w:r>
+      <w:proofErr w:type="spellStart"/>
+      <w:r>
+        <w:t>kar</w:t>
+      </w:r>
+      <w:proofErr w:type="spellEnd"/>
+      <w:r>
+        <w:t xml:space="preserve"> sake).</w:t>
+      </w:r>
+    </w:p>
+    <w:p>
+      <w:r>
+        <w:t xml:space="preserve">2. Data change audit trail — </w:t>
+      </w:r>
+      <w:proofErr w:type="spellStart"/>
+      <w:r>
+        <w:t>abhi</w:t>
+      </w:r>
+      <w:proofErr w:type="spellEnd"/>
+      <w:r>
+        <w:t xml:space="preserve"> _</w:t>
+      </w:r>
+      <w:proofErr w:type="spellStart"/>
+      <w:proofErr w:type="gramStart"/>
+      <w:r>
+        <w:t>logs.Write</w:t>
+      </w:r>
+      <w:proofErr w:type="spellEnd"/>
+      <w:proofErr w:type="gramEnd"/>
+      <w:r>
+        <w:t xml:space="preserve">() </w:t>
+      </w:r>
+      <w:proofErr w:type="spellStart"/>
+      <w:r>
+        <w:t>sirf</w:t>
+      </w:r>
+      <w:proofErr w:type="spellEnd"/>
+      <w:r>
+        <w:t xml:space="preserve"> exceptions pe call </w:t>
+      </w:r>
+      <w:proofErr w:type="spellStart"/>
+      <w:r>
+        <w:t>hota</w:t>
+      </w:r>
+      <w:proofErr w:type="spellEnd"/>
+      <w:r>
+        <w:t xml:space="preserve"> </w:t>
+      </w:r>
+      <w:proofErr w:type="spellStart"/>
+      <w:r>
+        <w:t>hai</w:t>
+      </w:r>
+      <w:proofErr w:type="spellEnd"/>
+      <w:r>
+        <w:t xml:space="preserve">. Invoice/job edit, delete, payment receive — </w:t>
+      </w:r>
+      <w:proofErr w:type="spellStart"/>
+      <w:r>
+        <w:t>har</w:t>
+      </w:r>
+      <w:proofErr w:type="spellEnd"/>
+      <w:r>
+        <w:t xml:space="preserve"> change ka record (Who, When, Old value, </w:t>
+      </w:r>
+      <w:proofErr w:type="gramStart"/>
+      <w:r>
+        <w:t>New</w:t>
+      </w:r>
+      <w:proofErr w:type="gramEnd"/>
+      <w:r>
+        <w:t xml:space="preserve"> value, IP) </w:t>
+      </w:r>
+      <w:proofErr w:type="spellStart"/>
+      <w:r>
+        <w:t>AuditLog</w:t>
+      </w:r>
+      <w:proofErr w:type="spellEnd"/>
+      <w:r>
+        <w:t xml:space="preserve"> table </w:t>
+      </w:r>
+      <w:proofErr w:type="spellStart"/>
+      <w:r>
+        <w:t>mein</w:t>
+      </w:r>
+      <w:proofErr w:type="spellEnd"/>
+      <w:r>
+        <w:t>.</w:t>
+      </w:r>
+    </w:p>
+    <w:p>
+      <w:r>
+        <w:t xml:space="preserve">3. Password one-way hashing — passwords AES se encrypt (reversible) ho </w:t>
+      </w:r>
+      <w:proofErr w:type="spellStart"/>
+      <w:r>
+        <w:t>rahe</w:t>
+      </w:r>
+      <w:proofErr w:type="spellEnd"/>
+      <w:r>
+        <w:t xml:space="preserve"> </w:t>
+      </w:r>
+      <w:proofErr w:type="spellStart"/>
+      <w:r>
+        <w:t>hain</w:t>
+      </w:r>
+      <w:proofErr w:type="spellEnd"/>
+      <w:r>
+        <w:t xml:space="preserve">, </w:t>
+      </w:r>
+      <w:proofErr w:type="spellStart"/>
+      <w:r>
+        <w:t>BCrypt</w:t>
+      </w:r>
+      <w:proofErr w:type="spellEnd"/>
+      <w:r>
+        <w:t xml:space="preserve">/PBKDF2 use karo. Ye CODE_REVIEW_POINTS.md </w:t>
+      </w:r>
+      <w:proofErr w:type="spellStart"/>
+      <w:r>
+        <w:t>mein</w:t>
+      </w:r>
+      <w:proofErr w:type="spellEnd"/>
+      <w:r>
+        <w:t xml:space="preserve"> </w:t>
+      </w:r>
+      <w:proofErr w:type="spellStart"/>
+      <w:r>
+        <w:t>bhi</w:t>
+      </w:r>
+      <w:proofErr w:type="spellEnd"/>
+      <w:r>
+        <w:t xml:space="preserve"> </w:t>
+      </w:r>
+      <w:proofErr w:type="spellStart"/>
+      <w:r>
+        <w:t>hai</w:t>
+      </w:r>
+      <w:proofErr w:type="spellEnd"/>
+      <w:r>
+        <w:t>.</w:t>
+      </w:r>
+    </w:p>
+    <w:p>
+      <w:r>
+        <w:t>4. 2FA rate limiting — /Account/</w:t>
+      </w:r>
+      <w:proofErr w:type="spellStart"/>
+      <w:r>
+        <w:t>VerifyTwoFactor</w:t>
+      </w:r>
+      <w:proofErr w:type="spellEnd"/>
+      <w:r>
+        <w:t xml:space="preserve"> pe koi attempt lockout </w:t>
+      </w:r>
+      <w:proofErr w:type="spellStart"/>
+      <w:r>
+        <w:t>nahi</w:t>
+      </w:r>
+      <w:proofErr w:type="spellEnd"/>
+      <w:r>
+        <w:t xml:space="preserve">, 6-digit code brute-force ho </w:t>
+      </w:r>
+      <w:proofErr w:type="spellStart"/>
+      <w:r>
+        <w:t>sakta</w:t>
+      </w:r>
+      <w:proofErr w:type="spellEnd"/>
+      <w:r>
+        <w:t xml:space="preserve"> </w:t>
+      </w:r>
+      <w:proofErr w:type="spellStart"/>
+      <w:r>
+        <w:t>hai</w:t>
+      </w:r>
+      <w:proofErr w:type="spellEnd"/>
+      <w:r>
+        <w:t>.</w:t>
+      </w:r>
+    </w:p>
+    <w:p>
+      <w:r>
+        <w:t xml:space="preserve">5. CSRF token — </w:t>
+      </w:r>
+      <w:proofErr w:type="spellStart"/>
+      <w:r>
+        <w:t>saare</w:t>
+      </w:r>
+      <w:proofErr w:type="spellEnd"/>
+      <w:r>
+        <w:t xml:space="preserve"> POST/AJAX calls </w:t>
+      </w:r>
+      <w:proofErr w:type="spellStart"/>
+      <w:r>
+        <w:t>bina</w:t>
+      </w:r>
+      <w:proofErr w:type="spellEnd"/>
+      <w:r>
+        <w:t xml:space="preserve"> token </w:t>
+      </w:r>
+      <w:proofErr w:type="spellStart"/>
+      <w:r>
+        <w:t>ke</w:t>
+      </w:r>
+      <w:proofErr w:type="spellEnd"/>
+      <w:r>
+        <w:t xml:space="preserve"> ja </w:t>
+      </w:r>
+      <w:proofErr w:type="spellStart"/>
+      <w:r>
+        <w:t>rahe</w:t>
+      </w:r>
+      <w:proofErr w:type="spellEnd"/>
+      <w:r>
+        <w:t xml:space="preserve"> </w:t>
+      </w:r>
+      <w:proofErr w:type="spellStart"/>
+      <w:r>
+        <w:t>hain</w:t>
+      </w:r>
+      <w:proofErr w:type="spellEnd"/>
+      <w:r>
+        <w:t>.</w:t>
+      </w:r>
+    </w:p>
+    <w:p>
+      <w:r>
+        <w:t xml:space="preserve">6. Session idle timeout + "logout all devices" — </w:t>
+      </w:r>
+      <w:proofErr w:type="spellStart"/>
+      <w:r>
+        <w:t>sirf</w:t>
+      </w:r>
+      <w:proofErr w:type="spellEnd"/>
+      <w:r>
+        <w:t xml:space="preserve"> logout button se puri session clear </w:t>
+      </w:r>
+      <w:proofErr w:type="spellStart"/>
+      <w:r>
+        <w:t>nahi</w:t>
+      </w:r>
+      <w:proofErr w:type="spellEnd"/>
+      <w:r>
+        <w:t xml:space="preserve"> </w:t>
+      </w:r>
+      <w:proofErr w:type="spellStart"/>
+      <w:r>
+        <w:t>hoti</w:t>
+      </w:r>
+      <w:proofErr w:type="spellEnd"/>
+      <w:r>
+        <w:t>.</w:t>
+      </w:r>
+    </w:p>
+    <w:p>
+      <w:r>
+        <w:t>B. Notification System (</w:t>
+      </w:r>
+      <w:proofErr w:type="spellStart"/>
+      <w:r>
+        <w:t>abhi</w:t>
+      </w:r>
+      <w:proofErr w:type="spellEnd"/>
+      <w:r>
+        <w:t xml:space="preserve"> </w:t>
+      </w:r>
+      <w:proofErr w:type="spellStart"/>
+      <w:r>
+        <w:t>bilkul</w:t>
+      </w:r>
+      <w:proofErr w:type="spellEnd"/>
+      <w:r>
+        <w:t xml:space="preserve"> </w:t>
+      </w:r>
+      <w:proofErr w:type="spellStart"/>
+      <w:r>
+        <w:t>nahi</w:t>
+      </w:r>
+      <w:proofErr w:type="spellEnd"/>
+      <w:r>
+        <w:t xml:space="preserve"> </w:t>
+      </w:r>
+      <w:proofErr w:type="spellStart"/>
+      <w:r>
+        <w:t>hai</w:t>
+      </w:r>
+      <w:proofErr w:type="spellEnd"/>
+      <w:r>
+        <w:t>)</w:t>
+      </w:r>
+    </w:p>
+    <w:p>
+      <w:r>
+        <w:t xml:space="preserve"> 7. Email/SMS integration — project </w:t>
+      </w:r>
+      <w:proofErr w:type="spellStart"/>
+      <w:r>
+        <w:t>mein</w:t>
+      </w:r>
+      <w:proofErr w:type="spellEnd"/>
+      <w:r>
+        <w:t xml:space="preserve"> koi </w:t>
+      </w:r>
+      <w:proofErr w:type="spellStart"/>
+      <w:r>
+        <w:t>bhi</w:t>
+      </w:r>
+      <w:proofErr w:type="spellEnd"/>
+      <w:r>
+        <w:t xml:space="preserve"> </w:t>
+      </w:r>
+      <w:proofErr w:type="spellStart"/>
+      <w:r>
+        <w:t>SmtpClient</w:t>
+      </w:r>
+      <w:proofErr w:type="spellEnd"/>
+      <w:r>
+        <w:t>/</w:t>
+      </w:r>
+      <w:proofErr w:type="spellStart"/>
+      <w:r>
+        <w:t>MailKit</w:t>
+      </w:r>
+      <w:proofErr w:type="spellEnd"/>
+      <w:r>
+        <w:t xml:space="preserve"> </w:t>
+      </w:r>
+      <w:proofErr w:type="spellStart"/>
+      <w:r>
+        <w:t>nahi</w:t>
+      </w:r>
+      <w:proofErr w:type="spellEnd"/>
+      <w:r>
+        <w:t xml:space="preserve"> </w:t>
+      </w:r>
+      <w:proofErr w:type="spellStart"/>
+      <w:r>
+        <w:t>hai</w:t>
+      </w:r>
+      <w:proofErr w:type="spellEnd"/>
+      <w:r>
+        <w:t>. Invoices generate hone pe customer ko email, payment receive hone pe finance ko alert.</w:t>
+      </w:r>
+    </w:p>
+    <w:p>
+      <w:r>
+        <w:t xml:space="preserve"> 8. In-app notification center — bell icon + unread count, "Job #123 ki invoice approve ho </w:t>
+      </w:r>
+      <w:proofErr w:type="spellStart"/>
+      <w:r>
+        <w:t>gayi</w:t>
+      </w:r>
+      <w:proofErr w:type="spellEnd"/>
+      <w:r>
+        <w:t>" type alerts.</w:t>
+      </w:r>
+    </w:p>
+    <w:p>
+      <w:r>
+        <w:t xml:space="preserve"> 9. Overdue payment reminders — auto reminder emails job/invoice </w:t>
+      </w:r>
+      <w:proofErr w:type="spellStart"/>
+      <w:r>
+        <w:t>ke</w:t>
+      </w:r>
+      <w:proofErr w:type="spellEnd"/>
+      <w:r>
+        <w:t xml:space="preserve"> due date </w:t>
+      </w:r>
+      <w:proofErr w:type="spellStart"/>
+      <w:r>
+        <w:t>ke</w:t>
+      </w:r>
+      <w:proofErr w:type="spellEnd"/>
+      <w:r>
+        <w:t xml:space="preserve"> </w:t>
+      </w:r>
+      <w:proofErr w:type="spellStart"/>
+      <w:r>
+        <w:t>mutabiq</w:t>
+      </w:r>
+      <w:proofErr w:type="spellEnd"/>
+      <w:r>
+        <w:t>.</w:t>
+      </w:r>
+    </w:p>
+    <w:p>
+      <w:r>
+        <w:t xml:space="preserve">10. Document expiry alerts — passport/visa/IATA/company license expiry (30 din </w:t>
+      </w:r>
+      <w:proofErr w:type="spellStart"/>
+      <w:r>
+        <w:t>pehle</w:t>
+      </w:r>
+      <w:proofErr w:type="spellEnd"/>
+      <w:r>
+        <w:t xml:space="preserve"> warning).</w:t>
+      </w:r>
+    </w:p>
+    <w:p>
+      <w:r>
+        <w:t>C. Workflow &amp; Approvals</w:t>
+      </w:r>
+    </w:p>
+    <w:p>
+      <w:r>
+        <w:t xml:space="preserve">11. Generic approval workflow — </w:t>
+      </w:r>
+      <w:proofErr w:type="spellStart"/>
+      <w:r>
+        <w:t>abhi</w:t>
+      </w:r>
+      <w:proofErr w:type="spellEnd"/>
+      <w:r>
+        <w:t xml:space="preserve"> </w:t>
+      </w:r>
+      <w:proofErr w:type="spellStart"/>
+      <w:r>
+        <w:t>sirf</w:t>
+      </w:r>
+      <w:proofErr w:type="spellEnd"/>
+      <w:r>
+        <w:t xml:space="preserve"> </w:t>
+      </w:r>
+      <w:proofErr w:type="spellStart"/>
+      <w:r>
+        <w:t>JobInvoiceAccessRequest</w:t>
+      </w:r>
+      <w:proofErr w:type="spellEnd"/>
+      <w:r>
+        <w:t xml:space="preserve"> (invoice access) pe approval </w:t>
+      </w:r>
+      <w:proofErr w:type="spellStart"/>
+      <w:r>
+        <w:t>hai</w:t>
+      </w:r>
+      <w:proofErr w:type="spellEnd"/>
+      <w:r>
+        <w:t xml:space="preserve">. Sales invoice, purchase invoice, credit note, job creation — sab </w:t>
+      </w:r>
+      <w:proofErr w:type="spellStart"/>
+      <w:r>
+        <w:t>ke</w:t>
+      </w:r>
+      <w:proofErr w:type="spellEnd"/>
+      <w:r>
+        <w:t xml:space="preserve"> </w:t>
+      </w:r>
+      <w:proofErr w:type="spellStart"/>
+      <w:r>
+        <w:t>liye</w:t>
+      </w:r>
+      <w:proofErr w:type="spellEnd"/>
+      <w:r>
+        <w:t xml:space="preserve"> configurable multi-level approval chain (Pending → Approved → Rejected) with remarks.</w:t>
+      </w:r>
+    </w:p>
+    <w:p>
+      <w:r>
+        <w:t xml:space="preserve">12. Maker/Checker separation — </w:t>
+      </w:r>
+      <w:proofErr w:type="spellStart"/>
+      <w:r>
+        <w:t>jis</w:t>
+      </w:r>
+      <w:proofErr w:type="spellEnd"/>
+      <w:r>
+        <w:t xml:space="preserve"> ne entry ki </w:t>
+      </w:r>
+      <w:proofErr w:type="spellStart"/>
+      <w:r>
+        <w:t>usko</w:t>
+      </w:r>
+      <w:proofErr w:type="spellEnd"/>
+      <w:r>
+        <w:t xml:space="preserve"> approve </w:t>
+      </w:r>
+      <w:proofErr w:type="spellStart"/>
+      <w:r>
+        <w:t>nahi</w:t>
+      </w:r>
+      <w:proofErr w:type="spellEnd"/>
+      <w:r>
+        <w:t xml:space="preserve"> </w:t>
+      </w:r>
+      <w:proofErr w:type="spellStart"/>
+      <w:r>
+        <w:t>karna</w:t>
+      </w:r>
+      <w:proofErr w:type="spellEnd"/>
+      <w:r>
+        <w:t xml:space="preserve"> </w:t>
+      </w:r>
+      <w:proofErr w:type="spellStart"/>
+      <w:r>
+        <w:t>chahiye</w:t>
+      </w:r>
+      <w:proofErr w:type="spellEnd"/>
+      <w:r>
+        <w:t xml:space="preserve">. Super admin </w:t>
+      </w:r>
+      <w:proofErr w:type="spellStart"/>
+      <w:r>
+        <w:t>ke</w:t>
+      </w:r>
+      <w:proofErr w:type="spellEnd"/>
+      <w:r>
+        <w:t xml:space="preserve"> </w:t>
+      </w:r>
+      <w:proofErr w:type="spellStart"/>
+      <w:r>
+        <w:t>ilawa</w:t>
+      </w:r>
+      <w:proofErr w:type="spellEnd"/>
+      <w:r>
+        <w:t xml:space="preserve"> 2nd person se approval.</w:t>
+      </w:r>
+    </w:p>
+    <w:p>
+      <w:r>
+        <w:lastRenderedPageBreak/>
+        <w:t>13. Rejection reason capture + notification back to maker.</w:t>
+      </w:r>
+    </w:p>
+    <w:p>
+      <w:r>
+        <w:t>D. Job / Shipment Tracking</w:t>
+      </w:r>
+    </w:p>
+    <w:p>
+      <w:r>
+        <w:t xml:space="preserve">14. Job status timeline — </w:t>
+      </w:r>
+      <w:proofErr w:type="spellStart"/>
+      <w:r>
+        <w:t>ShipmentStatus</w:t>
+      </w:r>
+      <w:proofErr w:type="spellEnd"/>
+      <w:r>
+        <w:t xml:space="preserve"> aur </w:t>
+      </w:r>
+      <w:proofErr w:type="spellStart"/>
+      <w:r>
+        <w:t>BLStatus</w:t>
+      </w:r>
+      <w:proofErr w:type="spellEnd"/>
+      <w:r>
+        <w:t xml:space="preserve"> models </w:t>
+      </w:r>
+      <w:proofErr w:type="spellStart"/>
+      <w:r>
+        <w:t>maujood</w:t>
+      </w:r>
+      <w:proofErr w:type="spellEnd"/>
+      <w:r>
+        <w:t xml:space="preserve"> </w:t>
+      </w:r>
+      <w:proofErr w:type="spellStart"/>
+      <w:r>
+        <w:t>hain</w:t>
+      </w:r>
+      <w:proofErr w:type="spellEnd"/>
+      <w:r>
+        <w:t xml:space="preserve"> </w:t>
+      </w:r>
+      <w:proofErr w:type="spellStart"/>
+      <w:r>
+        <w:t>magar</w:t>
+      </w:r>
+      <w:proofErr w:type="spellEnd"/>
+      <w:r>
+        <w:t xml:space="preserve"> UI pe almost use </w:t>
+      </w:r>
+      <w:proofErr w:type="spellStart"/>
+      <w:r>
+        <w:t>nahi</w:t>
+      </w:r>
+      <w:proofErr w:type="spellEnd"/>
+      <w:r>
+        <w:t xml:space="preserve"> ho </w:t>
+      </w:r>
+      <w:proofErr w:type="spellStart"/>
+      <w:r>
+        <w:t>rahe</w:t>
+      </w:r>
+      <w:proofErr w:type="spellEnd"/>
+      <w:r>
+        <w:t xml:space="preserve">. Har stage ka timeline (Booking → Documentation → Customs → Delivered → Closed) with date, remarks, aur un-comment ho </w:t>
+      </w:r>
+      <w:proofErr w:type="spellStart"/>
+      <w:r>
+        <w:t>gaye</w:t>
+      </w:r>
+      <w:proofErr w:type="spellEnd"/>
+      <w:r>
+        <w:t xml:space="preserve"> change history.</w:t>
+      </w:r>
+    </w:p>
+    <w:p>
+      <w:r>
+        <w:t xml:space="preserve">15. Document attachment on Jobs/Invoices — </w:t>
+      </w:r>
+      <w:proofErr w:type="spellStart"/>
+      <w:r>
+        <w:t>abhi</w:t>
+      </w:r>
+      <w:proofErr w:type="spellEnd"/>
+      <w:r>
+        <w:t xml:space="preserve"> </w:t>
+      </w:r>
+      <w:proofErr w:type="spellStart"/>
+      <w:r>
+        <w:t>sirf</w:t>
+      </w:r>
+      <w:proofErr w:type="spellEnd"/>
+      <w:r>
+        <w:t xml:space="preserve"> user photo upload </w:t>
+      </w:r>
+      <w:proofErr w:type="spellStart"/>
+      <w:r>
+        <w:t>hota</w:t>
+      </w:r>
+      <w:proofErr w:type="spellEnd"/>
+      <w:r>
+        <w:t xml:space="preserve"> </w:t>
+      </w:r>
+      <w:proofErr w:type="spellStart"/>
+      <w:r>
+        <w:t>hai</w:t>
+      </w:r>
+      <w:proofErr w:type="spellEnd"/>
+      <w:r>
+        <w:t xml:space="preserve">. BL scan, customs certificate, delivery order, invoice PDF attach </w:t>
+      </w:r>
+      <w:proofErr w:type="spellStart"/>
+      <w:r>
+        <w:t>karne</w:t>
+      </w:r>
+      <w:proofErr w:type="spellEnd"/>
+      <w:r>
+        <w:t xml:space="preserve"> ka feature missing </w:t>
+      </w:r>
+      <w:proofErr w:type="spellStart"/>
+      <w:r>
+        <w:t>hai</w:t>
+      </w:r>
+      <w:proofErr w:type="spellEnd"/>
+      <w:r>
+        <w:t>.</w:t>
+      </w:r>
+    </w:p>
+    <w:p>
+      <w:r>
+        <w:t>16. Global search — ek search box se job number, BL number, customer name, invoice number across whole system.</w:t>
+      </w:r>
+    </w:p>
+    <w:p>
+      <w:r>
+        <w:t xml:space="preserve">17. Job profit margin — </w:t>
+      </w:r>
+      <w:proofErr w:type="spellStart"/>
+      <w:r>
+        <w:t>har</w:t>
+      </w:r>
+      <w:proofErr w:type="spellEnd"/>
+      <w:r>
+        <w:t xml:space="preserve"> job pe actual cost vs invoice revenue ka live margin (gross profit %). Abhi data available </w:t>
+      </w:r>
+      <w:proofErr w:type="spellStart"/>
+      <w:r>
+        <w:t>hai</w:t>
+      </w:r>
+      <w:proofErr w:type="spellEnd"/>
+      <w:r>
+        <w:t xml:space="preserve"> par visible </w:t>
+      </w:r>
+      <w:proofErr w:type="spellStart"/>
+      <w:r>
+        <w:t>nahi</w:t>
+      </w:r>
+      <w:proofErr w:type="spellEnd"/>
+      <w:r>
+        <w:t>.</w:t>
+      </w:r>
+    </w:p>
+    <w:p>
+      <w:r>
+        <w:t>18. Container-level tracking — container no se search, shipment milestones, detention/demurrage dates.</w:t>
+      </w:r>
+    </w:p>
+    <w:p>
+      <w:r>
+        <w:t>E. Finance</w:t>
+      </w:r>
+    </w:p>
+    <w:p>
+      <w:r>
+        <w:t xml:space="preserve">19. Multi-currency support — </w:t>
+      </w:r>
+      <w:proofErr w:type="spellStart"/>
+      <w:r>
+        <w:t>abhi</w:t>
+      </w:r>
+      <w:proofErr w:type="spellEnd"/>
+      <w:r>
+        <w:t xml:space="preserve"> single currency assumption </w:t>
+      </w:r>
+      <w:proofErr w:type="spellStart"/>
+      <w:r>
+        <w:t>hai</w:t>
+      </w:r>
+      <w:proofErr w:type="spellEnd"/>
+      <w:r>
+        <w:t xml:space="preserve">. Invoice </w:t>
+      </w:r>
+      <w:proofErr w:type="spellStart"/>
+      <w:r>
+        <w:t>mein</w:t>
+      </w:r>
+      <w:proofErr w:type="spellEnd"/>
+      <w:r>
+        <w:t xml:space="preserve"> currency + exchange rate + base currency amount.</w:t>
+      </w:r>
+    </w:p>
+    <w:p>
+      <w:r>
+        <w:t xml:space="preserve">20. ZATCA e-invoicing actual submission — QR generate </w:t>
+      </w:r>
+      <w:proofErr w:type="spellStart"/>
+      <w:r>
+        <w:t>hota</w:t>
+      </w:r>
+      <w:proofErr w:type="spellEnd"/>
+      <w:r>
+        <w:t xml:space="preserve"> </w:t>
+      </w:r>
+      <w:proofErr w:type="spellStart"/>
+      <w:r>
+        <w:t>hai</w:t>
+      </w:r>
+      <w:proofErr w:type="spellEnd"/>
+      <w:r>
+        <w:t xml:space="preserve"> (Pattern D) </w:t>
+      </w:r>
+      <w:proofErr w:type="spellStart"/>
+      <w:r>
+        <w:t>lekin</w:t>
+      </w:r>
+      <w:proofErr w:type="spellEnd"/>
+      <w:r>
+        <w:t xml:space="preserve"> QR payload Phase-2 compliant </w:t>
+      </w:r>
+      <w:proofErr w:type="spellStart"/>
+      <w:r>
+        <w:t>nahi</w:t>
+      </w:r>
+      <w:proofErr w:type="spellEnd"/>
+      <w:r>
+        <w:t xml:space="preserve"> aur KSA </w:t>
+      </w:r>
+      <w:proofErr w:type="spellStart"/>
+      <w:r>
+        <w:t>mein</w:t>
+      </w:r>
+      <w:proofErr w:type="spellEnd"/>
+      <w:r>
+        <w:t xml:space="preserve"> e-invoice API se submit </w:t>
+      </w:r>
+      <w:proofErr w:type="spellStart"/>
+      <w:r>
+        <w:t>nahi</w:t>
+      </w:r>
+      <w:proofErr w:type="spellEnd"/>
+      <w:r>
+        <w:t xml:space="preserve"> </w:t>
+      </w:r>
+      <w:proofErr w:type="spellStart"/>
+      <w:r>
+        <w:t>hota</w:t>
+      </w:r>
+      <w:proofErr w:type="spellEnd"/>
+      <w:r>
+        <w:t>.</w:t>
+      </w:r>
+    </w:p>
+    <w:p>
+      <w:r>
+        <w:t>21. Bank reconciliation — payment received vs bank statement match, auto-matching by amount/reference.</w:t>
+      </w:r>
+    </w:p>
+    <w:p>
+      <w:r>
+        <w:t xml:space="preserve">22. Credit limit control — customer ka credit limit set </w:t>
+      </w:r>
+      <w:proofErr w:type="spellStart"/>
+      <w:r>
+        <w:t>karein</w:t>
+      </w:r>
+      <w:proofErr w:type="spellEnd"/>
+      <w:r>
+        <w:t xml:space="preserve">, invoice raise </w:t>
+      </w:r>
+      <w:proofErr w:type="spellStart"/>
+      <w:r>
+        <w:t>karte</w:t>
+      </w:r>
+      <w:proofErr w:type="spellEnd"/>
+      <w:r>
+        <w:t xml:space="preserve"> </w:t>
+      </w:r>
+      <w:proofErr w:type="spellStart"/>
+      <w:r>
+        <w:t>waqt</w:t>
+      </w:r>
+      <w:proofErr w:type="spellEnd"/>
+      <w:r>
+        <w:t xml:space="preserve"> check ho.</w:t>
+      </w:r>
+    </w:p>
+    <w:p>
+      <w:r>
+        <w:t xml:space="preserve">23. Financial year / period locking — </w:t>
+      </w:r>
+      <w:proofErr w:type="spellStart"/>
+      <w:r>
+        <w:t>pichle</w:t>
+      </w:r>
+      <w:proofErr w:type="spellEnd"/>
+      <w:r>
+        <w:t xml:space="preserve"> </w:t>
+      </w:r>
+      <w:proofErr w:type="spellStart"/>
+      <w:r>
+        <w:t>saal</w:t>
+      </w:r>
+      <w:proofErr w:type="spellEnd"/>
+      <w:r>
+        <w:t xml:space="preserve"> ki books close </w:t>
+      </w:r>
+      <w:proofErr w:type="spellStart"/>
+      <w:r>
+        <w:t>kar</w:t>
+      </w:r>
+      <w:proofErr w:type="spellEnd"/>
+      <w:r>
+        <w:t xml:space="preserve"> </w:t>
+      </w:r>
+      <w:proofErr w:type="spellStart"/>
+      <w:r>
+        <w:t>ke</w:t>
+      </w:r>
+      <w:proofErr w:type="spellEnd"/>
+      <w:r>
+        <w:t xml:space="preserve"> lock </w:t>
+      </w:r>
+      <w:proofErr w:type="spellStart"/>
+      <w:r>
+        <w:t>kar</w:t>
+      </w:r>
+      <w:proofErr w:type="spellEnd"/>
+      <w:r>
+        <w:t xml:space="preserve"> </w:t>
+      </w:r>
+      <w:proofErr w:type="spellStart"/>
+      <w:r>
+        <w:t>dein</w:t>
+      </w:r>
+      <w:proofErr w:type="spellEnd"/>
+      <w:r>
+        <w:t>.</w:t>
+      </w:r>
+    </w:p>
+    <w:p>
+      <w:r>
+        <w:t xml:space="preserve">24. Recurring invoices / monthly billing — ek customer </w:t>
+      </w:r>
+      <w:proofErr w:type="spellStart"/>
+      <w:r>
+        <w:t>ke</w:t>
+      </w:r>
+      <w:proofErr w:type="spellEnd"/>
+      <w:r>
+        <w:t xml:space="preserve"> multiple jobs ka consolidated monthly invoice.</w:t>
+      </w:r>
+    </w:p>
+    <w:p>
+      <w:r>
+        <w:t>F. Reports &amp; Analytics</w:t>
+      </w:r>
+    </w:p>
+    <w:p>
+      <w:r>
+        <w:t xml:space="preserve">25. Report scheduling + auto email — Aging, Customer SOA, Service Provider SOA ko schedule </w:t>
+      </w:r>
+      <w:proofErr w:type="spellStart"/>
+      <w:r>
+        <w:t>karein</w:t>
+      </w:r>
+      <w:proofErr w:type="spellEnd"/>
+      <w:r>
+        <w:t xml:space="preserve"> (weekly/monthly) aur email pe </w:t>
+      </w:r>
+      <w:proofErr w:type="spellStart"/>
+      <w:r>
+        <w:t>jaye</w:t>
+      </w:r>
+      <w:proofErr w:type="spellEnd"/>
+      <w:r>
+        <w:t>.</w:t>
+      </w:r>
+    </w:p>
+    <w:p>
+      <w:r>
+        <w:t xml:space="preserve">26. Custom report builder — user </w:t>
+      </w:r>
+      <w:proofErr w:type="spellStart"/>
+      <w:r>
+        <w:t>apne</w:t>
+      </w:r>
+      <w:proofErr w:type="spellEnd"/>
+      <w:r>
+        <w:t xml:space="preserve"> </w:t>
+      </w:r>
+      <w:proofErr w:type="spellStart"/>
+      <w:r>
+        <w:t>hisaab</w:t>
+      </w:r>
+      <w:proofErr w:type="spellEnd"/>
+      <w:r>
+        <w:t xml:space="preserve"> se columns/filter choose </w:t>
+      </w:r>
+      <w:proofErr w:type="spellStart"/>
+      <w:r>
+        <w:t>kar</w:t>
+      </w:r>
+      <w:proofErr w:type="spellEnd"/>
+      <w:r>
+        <w:t xml:space="preserve"> </w:t>
+      </w:r>
+      <w:proofErr w:type="spellStart"/>
+      <w:r>
+        <w:t>ke</w:t>
+      </w:r>
+      <w:proofErr w:type="spellEnd"/>
+      <w:r>
+        <w:t xml:space="preserve"> report </w:t>
+      </w:r>
+      <w:proofErr w:type="spellStart"/>
+      <w:r>
+        <w:t>banaye</w:t>
+      </w:r>
+      <w:proofErr w:type="spellEnd"/>
+      <w:r>
+        <w:t>.</w:t>
+      </w:r>
+    </w:p>
+    <w:p>
+      <w:r>
+        <w:t>27. Job profitability report — customer/service-provider wise margin analysis.</w:t>
+      </w:r>
+    </w:p>
+    <w:p>
+      <w:r>
+        <w:lastRenderedPageBreak/>
+        <w:t xml:space="preserve">28. Dashboard per role — </w:t>
+      </w:r>
+      <w:proofErr w:type="spellStart"/>
+      <w:r>
+        <w:t>abhi</w:t>
+      </w:r>
+      <w:proofErr w:type="spellEnd"/>
+      <w:r>
+        <w:t xml:space="preserve"> detail dashboard </w:t>
+      </w:r>
+      <w:proofErr w:type="spellStart"/>
+      <w:r>
+        <w:t>sirf</w:t>
+      </w:r>
+      <w:proofErr w:type="spellEnd"/>
+      <w:r>
+        <w:t xml:space="preserve"> Super Admin ka </w:t>
+      </w:r>
+      <w:proofErr w:type="spellStart"/>
+      <w:r>
+        <w:t>hai</w:t>
+      </w:r>
+      <w:proofErr w:type="spellEnd"/>
+      <w:r>
+        <w:t>. Authorize/</w:t>
+      </w:r>
+      <w:proofErr w:type="spellStart"/>
+      <w:r>
+        <w:t>UnAuthorize</w:t>
+      </w:r>
+      <w:proofErr w:type="spellEnd"/>
+      <w:r>
+        <w:t xml:space="preserve"> users </w:t>
+      </w:r>
+      <w:proofErr w:type="spellStart"/>
+      <w:r>
+        <w:t>ke</w:t>
+      </w:r>
+      <w:proofErr w:type="spellEnd"/>
+      <w:r>
+        <w:t xml:space="preserve"> </w:t>
+      </w:r>
+      <w:proofErr w:type="spellStart"/>
+      <w:r>
+        <w:t>liye</w:t>
+      </w:r>
+      <w:proofErr w:type="spellEnd"/>
+      <w:r>
+        <w:t xml:space="preserve"> </w:t>
+      </w:r>
+      <w:proofErr w:type="spellStart"/>
+      <w:r>
+        <w:t>apna</w:t>
+      </w:r>
+      <w:proofErr w:type="spellEnd"/>
+      <w:r>
+        <w:t xml:space="preserve"> dashboard (</w:t>
+      </w:r>
+      <w:proofErr w:type="spellStart"/>
+      <w:r>
+        <w:t>unke</w:t>
+      </w:r>
+      <w:proofErr w:type="spellEnd"/>
+      <w:r>
+        <w:t xml:space="preserve"> cost centers/costumers ka data).</w:t>
+      </w:r>
+    </w:p>
+    <w:p>
+      <w:r>
+        <w:t>29. Trend charts — revenue/margin month-over-month, top customers, top routes.</w:t>
+      </w:r>
+    </w:p>
+    <w:p>
+      <w:r>
+        <w:t>G. Data Management</w:t>
+      </w:r>
+    </w:p>
+    <w:p>
+      <w:r>
+        <w:t xml:space="preserve">30. Bulk operations — invoice list </w:t>
+      </w:r>
+      <w:proofErr w:type="spellStart"/>
+      <w:r>
+        <w:t>mein</w:t>
+      </w:r>
+      <w:proofErr w:type="spellEnd"/>
+      <w:r>
+        <w:t xml:space="preserve"> multi-select → bulk cancel/print/email; jobs bulk assign.</w:t>
+      </w:r>
+    </w:p>
+    <w:p>
+      <w:r>
+        <w:t xml:space="preserve">31. Soft delete + Trash/Restore — </w:t>
+      </w:r>
+      <w:proofErr w:type="spellStart"/>
+      <w:r>
+        <w:t>abhi</w:t>
+      </w:r>
+      <w:proofErr w:type="spellEnd"/>
+      <w:r>
+        <w:t xml:space="preserve"> hard delete </w:t>
+      </w:r>
+      <w:proofErr w:type="spellStart"/>
+      <w:r>
+        <w:t>hai</w:t>
+      </w:r>
+      <w:proofErr w:type="spellEnd"/>
+      <w:r>
+        <w:t xml:space="preserve">, </w:t>
+      </w:r>
+      <w:proofErr w:type="spellStart"/>
+      <w:r>
+        <w:t>galti</w:t>
+      </w:r>
+      <w:proofErr w:type="spellEnd"/>
+      <w:r>
+        <w:t xml:space="preserve"> se delete ho </w:t>
+      </w:r>
+      <w:proofErr w:type="spellStart"/>
+      <w:r>
+        <w:t>gaya</w:t>
+      </w:r>
+      <w:proofErr w:type="spellEnd"/>
+      <w:r>
+        <w:t xml:space="preserve"> </w:t>
+      </w:r>
+      <w:proofErr w:type="spellStart"/>
+      <w:r>
+        <w:t>toh</w:t>
+      </w:r>
+      <w:proofErr w:type="spellEnd"/>
+      <w:r>
+        <w:t xml:space="preserve"> </w:t>
+      </w:r>
+      <w:proofErr w:type="spellStart"/>
+      <w:r>
+        <w:t>wapas</w:t>
+      </w:r>
+      <w:proofErr w:type="spellEnd"/>
+      <w:r>
+        <w:t xml:space="preserve"> </w:t>
+      </w:r>
+      <w:proofErr w:type="spellStart"/>
+      <w:r>
+        <w:t>nahi</w:t>
+      </w:r>
+      <w:proofErr w:type="spellEnd"/>
+      <w:r>
+        <w:t xml:space="preserve"> </w:t>
+      </w:r>
+      <w:proofErr w:type="spellStart"/>
+      <w:r>
+        <w:t>aata</w:t>
+      </w:r>
+      <w:proofErr w:type="spellEnd"/>
+      <w:r>
+        <w:t>.</w:t>
+      </w:r>
+    </w:p>
+    <w:p>
+      <w:r>
+        <w:t xml:space="preserve">32. Data import wizard with validation preview — Excel upload karo, </w:t>
+      </w:r>
+      <w:proofErr w:type="spellStart"/>
+      <w:r>
+        <w:t>galat</w:t>
+      </w:r>
+      <w:proofErr w:type="spellEnd"/>
+      <w:r>
+        <w:t xml:space="preserve"> rows ka report </w:t>
+      </w:r>
+      <w:proofErr w:type="spellStart"/>
+      <w:r>
+        <w:t>dikhao</w:t>
+      </w:r>
+      <w:proofErr w:type="spellEnd"/>
+      <w:r>
+        <w:t xml:space="preserve">, </w:t>
+      </w:r>
+      <w:proofErr w:type="spellStart"/>
+      <w:r>
+        <w:t>phir</w:t>
+      </w:r>
+      <w:proofErr w:type="spellEnd"/>
+      <w:r>
+        <w:t xml:space="preserve"> clean import.</w:t>
+      </w:r>
+    </w:p>
+    <w:p>
+      <w:r>
+        <w:t xml:space="preserve">33. Duplicate detection — same job number / invoice number / customer duplicate se </w:t>
+      </w:r>
+      <w:proofErr w:type="spellStart"/>
+      <w:r>
+        <w:t>rokne</w:t>
+      </w:r>
+      <w:proofErr w:type="spellEnd"/>
+      <w:r>
+        <w:t xml:space="preserve"> </w:t>
+      </w:r>
+      <w:proofErr w:type="spellStart"/>
+      <w:r>
+        <w:t>ke</w:t>
+      </w:r>
+      <w:proofErr w:type="spellEnd"/>
+      <w:r>
+        <w:t xml:space="preserve"> </w:t>
+      </w:r>
+      <w:proofErr w:type="spellStart"/>
+      <w:r>
+        <w:t>liye</w:t>
+      </w:r>
+      <w:proofErr w:type="spellEnd"/>
+      <w:r>
+        <w:t xml:space="preserve"> warning.</w:t>
+      </w:r>
+    </w:p>
+    <w:p>
+      <w:r>
+        <w:t xml:space="preserve">34. Global Date/Currency/Cost Center defaults in Settings — </w:t>
+      </w:r>
+      <w:proofErr w:type="spellStart"/>
+      <w:r>
+        <w:t>abhi</w:t>
+      </w:r>
+      <w:proofErr w:type="spellEnd"/>
+      <w:r>
+        <w:t xml:space="preserve"> settings </w:t>
+      </w:r>
+      <w:proofErr w:type="spellStart"/>
+      <w:r>
+        <w:t>mein</w:t>
+      </w:r>
+      <w:proofErr w:type="spellEnd"/>
+      <w:r>
+        <w:t xml:space="preserve"> </w:t>
+      </w:r>
+      <w:proofErr w:type="spellStart"/>
+      <w:r>
+        <w:t>sirf</w:t>
+      </w:r>
+      <w:proofErr w:type="spellEnd"/>
+      <w:r>
+        <w:t xml:space="preserve"> 2 keys </w:t>
+      </w:r>
+      <w:proofErr w:type="spellStart"/>
+      <w:r>
+        <w:t>hain</w:t>
+      </w:r>
+      <w:proofErr w:type="spellEnd"/>
+      <w:r>
+        <w:t>.</w:t>
+      </w:r>
+    </w:p>
+    <w:p>
+      <w:r>
+        <w:t>H. Performance &amp; UX</w:t>
+      </w:r>
+    </w:p>
+    <w:p>
+      <w:r>
+        <w:t xml:space="preserve">35. Indexing — Users, </w:t>
+      </w:r>
+      <w:proofErr w:type="spellStart"/>
+      <w:r>
+        <w:t>JobImportMasters</w:t>
+      </w:r>
+      <w:proofErr w:type="spellEnd"/>
+      <w:r>
+        <w:t xml:space="preserve">, </w:t>
+      </w:r>
+      <w:proofErr w:type="spellStart"/>
+      <w:r>
+        <w:t>SalesInvoices</w:t>
+      </w:r>
+      <w:proofErr w:type="spellEnd"/>
+      <w:r>
+        <w:t xml:space="preserve">, </w:t>
+      </w:r>
+      <w:proofErr w:type="spellStart"/>
+      <w:r>
+        <w:t>PurchaseInvoices</w:t>
+      </w:r>
+      <w:proofErr w:type="spellEnd"/>
+      <w:r>
+        <w:t xml:space="preserve"> pe proper indexes (filter columns + dates). Data </w:t>
+      </w:r>
+      <w:proofErr w:type="spellStart"/>
+      <w:r>
+        <w:t>barhne</w:t>
+      </w:r>
+      <w:proofErr w:type="spellEnd"/>
+      <w:r>
+        <w:t xml:space="preserve"> pe reports slow </w:t>
+      </w:r>
+      <w:proofErr w:type="spellStart"/>
+      <w:r>
+        <w:t>honge</w:t>
+      </w:r>
+      <w:proofErr w:type="spellEnd"/>
+      <w:r>
+        <w:t>.</w:t>
+      </w:r>
+    </w:p>
+    <w:p>
+      <w:r>
+        <w:t xml:space="preserve">36. Server-side pagination everywhere — </w:t>
+      </w:r>
+      <w:proofErr w:type="spellStart"/>
+      <w:r>
+        <w:t>DataTables</w:t>
+      </w:r>
+      <w:proofErr w:type="spellEnd"/>
+      <w:r>
+        <w:t xml:space="preserve"> sab </w:t>
+      </w:r>
+      <w:proofErr w:type="spellStart"/>
+      <w:r>
+        <w:t>jagah</w:t>
+      </w:r>
+      <w:proofErr w:type="spellEnd"/>
+      <w:r>
+        <w:t xml:space="preserve"> already server-side </w:t>
+      </w:r>
+      <w:proofErr w:type="spellStart"/>
+      <w:r>
+        <w:t>hai</w:t>
+      </w:r>
+      <w:proofErr w:type="spellEnd"/>
+      <w:r>
+        <w:t>, verify karo.</w:t>
+      </w:r>
+    </w:p>
+    <w:p>
+      <w:r>
+        <w:t xml:space="preserve">37. PDF/Invoice generation caching — </w:t>
+      </w:r>
+      <w:proofErr w:type="spellStart"/>
+      <w:r>
+        <w:t>har</w:t>
+      </w:r>
+      <w:proofErr w:type="spellEnd"/>
+      <w:r>
+        <w:t xml:space="preserve"> invoice open pe PDF regenerate </w:t>
+      </w:r>
+      <w:proofErr w:type="spellStart"/>
+      <w:r>
+        <w:t>hota</w:t>
+      </w:r>
+      <w:proofErr w:type="spellEnd"/>
+      <w:r>
+        <w:t xml:space="preserve"> </w:t>
+      </w:r>
+      <w:proofErr w:type="spellStart"/>
+      <w:r>
+        <w:t>hai</w:t>
+      </w:r>
+      <w:proofErr w:type="spellEnd"/>
+      <w:r>
+        <w:t>, cache karo.</w:t>
+      </w:r>
+    </w:p>
+    <w:p>
+      <w:r>
+        <w:t xml:space="preserve">38. Mobile responsive layout — Bootstrap 4 based, </w:t>
+      </w:r>
+      <w:proofErr w:type="spellStart"/>
+      <w:r>
+        <w:t>chhoti</w:t>
+      </w:r>
+      <w:proofErr w:type="spellEnd"/>
+      <w:r>
+        <w:t xml:space="preserve"> screens pe Invoice/Job forms toot </w:t>
+      </w:r>
+      <w:proofErr w:type="spellStart"/>
+      <w:r>
+        <w:t>rahe</w:t>
+      </w:r>
+      <w:proofErr w:type="spellEnd"/>
+      <w:r>
+        <w:t xml:space="preserve"> </w:t>
+      </w:r>
+      <w:proofErr w:type="spellStart"/>
+      <w:r>
+        <w:t>honge</w:t>
+      </w:r>
+      <w:proofErr w:type="spellEnd"/>
+      <w:r>
+        <w:t>.</w:t>
+      </w:r>
+    </w:p>
+    <w:p>
+      <w:r>
+        <w:t xml:space="preserve">39. Loading spinners + better error messages — API fail hone par silent </w:t>
+      </w:r>
+      <w:proofErr w:type="spellStart"/>
+      <w:r>
+        <w:t>rehna</w:t>
+      </w:r>
+      <w:proofErr w:type="spellEnd"/>
+      <w:r>
+        <w:t>.</w:t>
+      </w:r>
+    </w:p>
+    <w:p>
+      <w:r>
+        <w:t>I. Technical Debt (quick wins)</w:t>
+      </w:r>
+    </w:p>
+    <w:p>
+      <w:r>
+        <w:t xml:space="preserve">40. Program.cs:38 — </w:t>
+      </w:r>
+      <w:proofErr w:type="spellStart"/>
+      <w:r>
+        <w:t>AddScoped</w:t>
+      </w:r>
+      <w:proofErr w:type="spellEnd"/>
+      <w:r>
+        <w:t>&lt;</w:t>
+      </w:r>
+      <w:proofErr w:type="spellStart"/>
+      <w:r>
+        <w:t>AppDbContext</w:t>
+      </w:r>
+      <w:proofErr w:type="spellEnd"/>
+      <w:proofErr w:type="gramStart"/>
+      <w:r>
+        <w:t>&gt;(</w:t>
+      </w:r>
+      <w:proofErr w:type="gramEnd"/>
+      <w:r>
+        <w:t xml:space="preserve">) + </w:t>
+      </w:r>
+      <w:proofErr w:type="spellStart"/>
+      <w:r>
+        <w:t>AddDbContext</w:t>
+      </w:r>
+      <w:proofErr w:type="spellEnd"/>
+      <w:r>
+        <w:t>&lt;</w:t>
+      </w:r>
+      <w:proofErr w:type="spellStart"/>
+      <w:r>
+        <w:t>AppDbContext</w:t>
+      </w:r>
+      <w:proofErr w:type="spellEnd"/>
+      <w:proofErr w:type="gramStart"/>
+      <w:r>
+        <w:t>&gt;(</w:t>
+      </w:r>
+      <w:proofErr w:type="gramEnd"/>
+      <w:r>
+        <w:t xml:space="preserve">) double registration </w:t>
+      </w:r>
+      <w:proofErr w:type="spellStart"/>
+      <w:r>
+        <w:t>hatao</w:t>
+      </w:r>
+      <w:proofErr w:type="spellEnd"/>
+      <w:r>
+        <w:t>.</w:t>
+      </w:r>
+    </w:p>
+    <w:p>
+      <w:r>
+        <w:t xml:space="preserve">41. </w:t>
+      </w:r>
+      <w:proofErr w:type="spellStart"/>
+      <w:r>
+        <w:t>SettingController</w:t>
+      </w:r>
+      <w:proofErr w:type="spellEnd"/>
+      <w:r>
+        <w:t xml:space="preserve"> ab Controller extend </w:t>
+      </w:r>
+      <w:proofErr w:type="spellStart"/>
+      <w:r>
+        <w:t>karta</w:t>
+      </w:r>
+      <w:proofErr w:type="spellEnd"/>
+      <w:r>
+        <w:t xml:space="preserve"> </w:t>
+      </w:r>
+      <w:proofErr w:type="spellStart"/>
+      <w:r>
+        <w:t>hai</w:t>
+      </w:r>
+      <w:proofErr w:type="spellEnd"/>
+      <w:r>
+        <w:t xml:space="preserve">, </w:t>
+      </w:r>
+      <w:proofErr w:type="spellStart"/>
+      <w:r>
+        <w:t>BaseController</w:t>
+      </w:r>
+      <w:proofErr w:type="spellEnd"/>
+      <w:r>
+        <w:t xml:space="preserve"> </w:t>
+      </w:r>
+      <w:proofErr w:type="spellStart"/>
+      <w:r>
+        <w:t>nahi</w:t>
+      </w:r>
+      <w:proofErr w:type="spellEnd"/>
+      <w:r>
+        <w:t xml:space="preserve"> — </w:t>
+      </w:r>
+      <w:proofErr w:type="spellStart"/>
+      <w:r>
+        <w:t>isliye</w:t>
+      </w:r>
+      <w:proofErr w:type="spellEnd"/>
+      <w:r>
+        <w:t xml:space="preserve"> session guard apply </w:t>
+      </w:r>
+      <w:proofErr w:type="spellStart"/>
+      <w:r>
+        <w:t>nahi</w:t>
+      </w:r>
+      <w:proofErr w:type="spellEnd"/>
+      <w:r>
+        <w:t xml:space="preserve"> </w:t>
+      </w:r>
+      <w:proofErr w:type="spellStart"/>
+      <w:r>
+        <w:t>hota</w:t>
+      </w:r>
+      <w:proofErr w:type="spellEnd"/>
+      <w:r>
+        <w:t xml:space="preserve"> (</w:t>
+      </w:r>
+      <w:proofErr w:type="spellStart"/>
+      <w:r>
+        <w:t>maine</w:t>
+      </w:r>
+      <w:proofErr w:type="spellEnd"/>
+      <w:r>
+        <w:t xml:space="preserve"> 2FA/QR toggle pe guard </w:t>
+      </w:r>
+      <w:proofErr w:type="spellStart"/>
+      <w:r>
+        <w:t>lagaya</w:t>
+      </w:r>
+      <w:proofErr w:type="spellEnd"/>
+      <w:r>
+        <w:t xml:space="preserve">, </w:t>
+      </w:r>
+      <w:proofErr w:type="spellStart"/>
+      <w:r>
+        <w:t>baaki</w:t>
+      </w:r>
+      <w:proofErr w:type="spellEnd"/>
+      <w:r>
+        <w:t xml:space="preserve"> endpoints pe </w:t>
+      </w:r>
+      <w:proofErr w:type="spellStart"/>
+      <w:r>
+        <w:t>bhi</w:t>
+      </w:r>
+      <w:proofErr w:type="spellEnd"/>
+      <w:r>
+        <w:t xml:space="preserve"> </w:t>
+      </w:r>
+      <w:proofErr w:type="spellStart"/>
+      <w:r>
+        <w:t>lagana</w:t>
+      </w:r>
+      <w:proofErr w:type="spellEnd"/>
+      <w:r>
+        <w:t xml:space="preserve"> </w:t>
+      </w:r>
+      <w:proofErr w:type="spellStart"/>
+      <w:r>
+        <w:t>chahiye</w:t>
+      </w:r>
+      <w:proofErr w:type="spellEnd"/>
+      <w:r>
+        <w:t>).</w:t>
+      </w:r>
+    </w:p>
+    <w:p>
+      <w:r>
+        <w:t xml:space="preserve">42. </w:t>
+      </w:r>
+      <w:proofErr w:type="spellStart"/>
+      <w:r>
+        <w:t>UserType</w:t>
+      </w:r>
+      <w:proofErr w:type="spellEnd"/>
+      <w:r>
+        <w:t xml:space="preserve"> numbering inconsistent </w:t>
+      </w:r>
+      <w:proofErr w:type="spellStart"/>
+      <w:r>
+        <w:t>hai</w:t>
+      </w:r>
+      <w:proofErr w:type="spellEnd"/>
+      <w:r>
+        <w:t>: Users.cshtml:78 (2=Authorize, 3=</w:t>
+      </w:r>
+      <w:proofErr w:type="spellStart"/>
+      <w:r>
+        <w:t>UnAuthorize</w:t>
+      </w:r>
+      <w:proofErr w:type="spellEnd"/>
+      <w:r>
+        <w:t>) vs _Layout.cshtml:184 (3=Authorize, 4=</w:t>
+      </w:r>
+      <w:proofErr w:type="spellStart"/>
+      <w:r>
+        <w:t>UnAuthorize</w:t>
+      </w:r>
+      <w:proofErr w:type="spellEnd"/>
+      <w:r>
+        <w:t xml:space="preserve">). Enums </w:t>
+      </w:r>
+      <w:proofErr w:type="spellStart"/>
+      <w:r>
+        <w:t>banao</w:t>
+      </w:r>
+      <w:proofErr w:type="spellEnd"/>
+      <w:r>
+        <w:t>.</w:t>
+      </w:r>
+    </w:p>
+    <w:p>
+      <w:r>
+        <w:lastRenderedPageBreak/>
+        <w:t xml:space="preserve">43. </w:t>
+      </w:r>
+      <w:proofErr w:type="spellStart"/>
+      <w:r>
+        <w:t>SalesInvoiceService.cs</w:t>
+      </w:r>
+      <w:proofErr w:type="spellEnd"/>
+      <w:r>
+        <w:t xml:space="preserve"> (~2662 lines), </w:t>
+      </w:r>
+      <w:proofErr w:type="spellStart"/>
+      <w:r>
+        <w:t>JobImportMasterService.cs</w:t>
+      </w:r>
+      <w:proofErr w:type="spellEnd"/>
+      <w:r>
+        <w:t xml:space="preserve"> (~2200 lines) — PDF/Excel/validation logic split karo.</w:t>
+      </w:r>
+    </w:p>
+    <w:p>
+      <w:r>
+        <w:t xml:space="preserve">44. </w:t>
+      </w:r>
+      <w:proofErr w:type="spellStart"/>
+      <w:r>
+        <w:t>BusinessLogic</w:t>
+      </w:r>
+      <w:proofErr w:type="spellEnd"/>
+      <w:r>
+        <w:t xml:space="preserve">\Class1.cs empty template file, </w:t>
+      </w:r>
+      <w:proofErr w:type="spellStart"/>
+      <w:r>
+        <w:t>Account.cs</w:t>
+      </w:r>
+      <w:proofErr w:type="spellEnd"/>
+      <w:r>
+        <w:t xml:space="preserve"> </w:t>
+      </w:r>
+      <w:proofErr w:type="spellStart"/>
+      <w:r>
+        <w:t>mein</w:t>
+      </w:r>
+      <w:proofErr w:type="spellEnd"/>
+      <w:r>
+        <w:t xml:space="preserve"> </w:t>
+      </w:r>
+      <w:proofErr w:type="spellStart"/>
+      <w:r>
+        <w:t>SaveUserBk</w:t>
+      </w:r>
+      <w:proofErr w:type="spellEnd"/>
+      <w:r>
+        <w:t>()/</w:t>
+      </w:r>
+      <w:proofErr w:type="spellStart"/>
+      <w:proofErr w:type="gramStart"/>
+      <w:r>
+        <w:t>GetUserBk</w:t>
+      </w:r>
+      <w:proofErr w:type="spellEnd"/>
+      <w:r>
+        <w:t>(</w:t>
+      </w:r>
+      <w:proofErr w:type="gramEnd"/>
+      <w:r>
+        <w:t>) dead code — delete.</w:t>
+      </w:r>
+    </w:p>
+    <w:p>
+      <w:r>
+        <w:t xml:space="preserve">45. Common </w:t>
+      </w:r>
+      <w:proofErr w:type="spellStart"/>
+      <w:r>
+        <w:t>ApiResponse</w:t>
+      </w:r>
+      <w:proofErr w:type="spellEnd"/>
+      <w:r>
+        <w:t xml:space="preserve">&lt;T&gt; class </w:t>
+      </w:r>
+      <w:proofErr w:type="spellStart"/>
+      <w:r>
+        <w:t>banao</w:t>
+      </w:r>
+      <w:proofErr w:type="spellEnd"/>
+      <w:r>
+        <w:t xml:space="preserve"> — </w:t>
+      </w:r>
+      <w:proofErr w:type="spellStart"/>
+      <w:r>
+        <w:t>abhi</w:t>
+      </w:r>
+      <w:proofErr w:type="spellEnd"/>
+      <w:r>
+        <w:t xml:space="preserve"> </w:t>
+      </w:r>
+      <w:proofErr w:type="spellStart"/>
+      <w:r>
+        <w:t>har</w:t>
+      </w:r>
+      <w:proofErr w:type="spellEnd"/>
+      <w:r>
+        <w:t xml:space="preserve"> endpoint ka response shape </w:t>
+      </w:r>
+      <w:proofErr w:type="spellStart"/>
+      <w:r>
+        <w:t>alag</w:t>
+      </w:r>
+      <w:proofErr w:type="spellEnd"/>
+      <w:r>
+        <w:t xml:space="preserve"> </w:t>
+      </w:r>
+      <w:proofErr w:type="spellStart"/>
+      <w:r>
+        <w:t>hai</w:t>
+      </w:r>
+      <w:proofErr w:type="spellEnd"/>
+    </w:p>
     <w:sectPr>
       <w:pgSz w:w="12240" w:h="15840"/>
       <w:pgMar w:top="1440" w:right="1440" w:bottom="1440" w:left="1440" w:header="720" w:footer="720" w:gutter="0"/>

</xml_diff>